<commit_message>
Presentation: script v3 in everyday words; RQ3 on slide 7 reworded simply
Co-Authored-By: Claude Opus 5.5 <noreply@anthropic.com>
Claude-Session: https://claude.ai/code/session_019GGG1f33Kz2g4dpPAJoY44
</commit_message>
<xml_diff>
--- a/evidence/prom06/presentation/PROM06_Speaker_Script.docx
+++ b/evidence/prom06/presentation/PROM06_Speaker_Script.docx
@@ -70,7 +70,7 @@
         <w:spacing w:after="80"/>
       </w:pPr>
       <w:r>
-        <w:t xml:space="preserve">It is about 1,600 words and takes about 13 minutes at a steady pace (125 words a minute). The brief allows 10 to 15 minutes.</w:t>
+        <w:t xml:space="preserve">It is about 1,650 words and takes about 13 minutes at a steady pace (125 words a minute). The brief allows 10 to 15 minutes.</w:t>
       </w:r>
     </w:p>
     <w:p>
@@ -495,7 +495,7 @@
                 <w:sz w:val="21"/>
                 <w:szCs w:val="21"/>
               </w:rPr>
-              <w:t xml:space="preserve">1:25</w:t>
+              <w:t xml:space="preserve">1:30</w:t>
             </w:r>
           </w:p>
         </w:tc>
@@ -527,7 +527,7 @@
                 <w:sz w:val="21"/>
                 <w:szCs w:val="21"/>
               </w:rPr>
-              <w:t xml:space="preserve">2:10</w:t>
+              <w:t xml:space="preserve">2:15</w:t>
             </w:r>
           </w:p>
         </w:tc>
@@ -622,7 +622,7 @@
                 <w:sz w:val="21"/>
                 <w:szCs w:val="21"/>
               </w:rPr>
-              <w:t xml:space="preserve">1:20</w:t>
+              <w:t xml:space="preserve">1:15</w:t>
             </w:r>
           </w:p>
         </w:tc>
@@ -751,7 +751,7 @@
                 <w:sz w:val="21"/>
                 <w:szCs w:val="21"/>
               </w:rPr>
-              <w:t xml:space="preserve">1:10</w:t>
+              <w:t xml:space="preserve">1:20</w:t>
             </w:r>
           </w:p>
         </w:tc>
@@ -783,7 +783,7 @@
                 <w:sz w:val="21"/>
                 <w:szCs w:val="21"/>
               </w:rPr>
-              <w:t xml:space="preserve">4:40</w:t>
+              <w:t xml:space="preserve">4:50</w:t>
             </w:r>
           </w:p>
         </w:tc>
@@ -878,7 +878,7 @@
                 <w:sz w:val="21"/>
                 <w:szCs w:val="21"/>
               </w:rPr>
-              <w:t xml:space="preserve">1:25</w:t>
+              <w:t xml:space="preserve">1:15</w:t>
             </w:r>
           </w:p>
         </w:tc>
@@ -1134,7 +1134,7 @@
                 <w:sz w:val="21"/>
                 <w:szCs w:val="21"/>
               </w:rPr>
-              <w:t xml:space="preserve">1:30</w:t>
+              <w:t xml:space="preserve">1:40</w:t>
             </w:r>
           </w:p>
         </w:tc>
@@ -1165,7 +1165,7 @@
                 <w:sz w:val="21"/>
                 <w:szCs w:val="21"/>
               </w:rPr>
-              <w:t xml:space="preserve">9:00</w:t>
+              <w:t xml:space="preserve">9:10</w:t>
             </w:r>
           </w:p>
         </w:tc>
@@ -1263,7 +1263,7 @@
                 <w:sz w:val="21"/>
                 <w:szCs w:val="21"/>
               </w:rPr>
-              <w:t xml:space="preserve">1:30</w:t>
+              <w:t xml:space="preserve">1:35</w:t>
             </w:r>
           </w:p>
         </w:tc>
@@ -1295,7 +1295,7 @@
                 <w:sz w:val="21"/>
                 <w:szCs w:val="21"/>
               </w:rPr>
-              <w:t xml:space="preserve">10:30</w:t>
+              <w:t xml:space="preserve">10:45</w:t>
             </w:r>
           </w:p>
         </w:tc>
@@ -1421,7 +1421,7 @@
                 <w:sz w:val="21"/>
                 <w:szCs w:val="21"/>
               </w:rPr>
-              <w:t xml:space="preserve">11:50</w:t>
+              <w:t xml:space="preserve">12:05</w:t>
             </w:r>
           </w:p>
         </w:tc>
@@ -1551,7 +1551,7 @@
                 <w:sz w:val="21"/>
                 <w:szCs w:val="21"/>
               </w:rPr>
-              <w:t xml:space="preserve">13:00</w:t>
+              <w:t xml:space="preserve">13:15</w:t>
             </w:r>
           </w:p>
         </w:tc>
@@ -1599,15 +1599,15 @@
         <w:pStyle w:val="Script"/>
       </w:pPr>
       <w:r>
-        <w:t xml:space="preserve">My project evaluates AI-driven security review in a DevSecOps pipeline. In simple terms, I built a pipeline where three reviewers check the same Terraform code: two well-known scanners, Checkov and tfsec, and an AI reviewer. Then I compared their results.</w:t>
-      </w:r>
-    </w:p>
-    <w:p>
-      <w:pPr>
-        <w:pStyle w:val="Script"/>
-      </w:pPr>
-      <w:r>
-        <w:t xml:space="preserve">I’ll explain why this matters, what I built, how I tested it, what I found and what it means.</w:t>
+        <w:t xml:space="preserve">My project asks a simple question: can an AI tool help to find security problems in cloud code? I built a system where three tools check the same code: two well-known scanners, called Checkov and tfsec, and an AI reviewer. Then I compared their results.</w:t>
+      </w:r>
+    </w:p>
+    <w:p>
+      <w:pPr>
+        <w:pStyle w:val="Script"/>
+      </w:pPr>
+      <w:r>
+        <w:t xml:space="preserve">I will explain why this matters, what I built, how I tested it, and what I found.</w:t>
       </w:r>
     </w:p>
     <w:p>
@@ -1628,7 +1628,7 @@
         <w:rPr>
           <w:color w:val="5B6670"/>
         </w:rPr>
-        <w:t xml:space="preserve">   ·   about 1:25   ·   2:10 in total</w:t>
+        <w:t xml:space="preserve">   ·   about 1:30   ·   2:15 in total</w:t>
       </w:r>
     </w:p>
     <w:p>
@@ -1644,31 +1644,31 @@
         <w:pStyle w:val="Script"/>
       </w:pPr>
       <w:r>
-        <w:t xml:space="preserve">Today, cloud infrastructure is written as code. With Terraform, one insecure line, such as a firewall rule open to the whole internet, is copied into every environment that uses it. And in the cloud, setting things up securely is the customer’s job, not the provider’s.</w:t>
-      </w:r>
-    </w:p>
-    <w:p>
-      <w:pPr>
-        <w:pStyle w:val="Script"/>
-      </w:pPr>
-      <w:r>
-        <w:t xml:space="preserve">Most teams catch these mistakes with rule-based scanners. They are fast and consistent, but they only find what their rules describe. And developers often ignore warnings that are noisy or hard to understand.</w:t>
-      </w:r>
-    </w:p>
-    <w:p>
-      <w:pPr>
-        <w:pStyle w:val="Script"/>
-      </w:pPr>
-      <w:r>
-        <w:t xml:space="preserve">AI reviewers work differently. They read the whole configuration and explain problems in plain language. But they can also be confidently wrong, and give different answers to the same question.</w:t>
-      </w:r>
-    </w:p>
-    <w:p>
-      <w:pPr>
-        <w:pStyle w:val="Script"/>
-      </w:pPr>
-      <w:r>
-        <w:t xml:space="preserve">So my aim was to evaluate how well an AI security reviewer works in a DevSecOps pipeline, compared with Checkov and tfsec. I asked four questions: how accurate it is, how good its fixes are, how it is likely to affect developer understanding, and what problems come up in practice. My objectives were to review the literature, build the pipeline, test it against fixed answers, and find its benefits and limits.</w:t>
+        <w:t xml:space="preserve">Today, cloud systems are often built with code, using a tool called Terraform. But if one line is insecure, for example a firewall rule that lets anyone on the internet connect, that mistake is copied everywhere the code is used. And keeping these settings safe is the customer’s job, not the cloud provider’s.</w:t>
+      </w:r>
+    </w:p>
+    <w:p>
+      <w:pPr>
+        <w:pStyle w:val="Script"/>
+      </w:pPr>
+      <w:r>
+        <w:t xml:space="preserve">To catch these mistakes, teams use scanners. A scanner checks code against a list of rules. Scanners are fast, but they only find problems that are on their list. And developers often ignore warnings that are hard to understand.</w:t>
+      </w:r>
+    </w:p>
+    <w:p>
+      <w:pPr>
+        <w:pStyle w:val="Script"/>
+      </w:pPr>
+      <w:r>
+        <w:t xml:space="preserve">AI reviewers can read all the code and explain problems in plain English. But they can be wrong while sounding sure, and they can give different answers to the same question.</w:t>
+      </w:r>
+    </w:p>
+    <w:p>
+      <w:pPr>
+        <w:pStyle w:val="Script"/>
+      </w:pPr>
+      <w:r>
+        <w:t xml:space="preserve">So my aim was to find out how well an AI reviewer works, compared with these scanners. I asked four questions. How accurate is it? How good are its fixes? Will its comments help developers understand? And what problems come up in real use? My objectives were to read the research, build the system, test it fairly, and find its strengths and limits.</w:t>
       </w:r>
     </w:p>
     <w:p>
@@ -1689,7 +1689,7 @@
         <w:rPr>
           <w:color w:val="5B6670"/>
         </w:rPr>
-        <w:t xml:space="preserve">   ·   about 1:20   ·   3:30 in total</w:t>
+        <w:t xml:space="preserve">   ·   about 1:15   ·   3:30 in total</w:t>
       </w:r>
     </w:p>
     <w:p>
@@ -1705,47 +1705,47 @@
         <w:pStyle w:val="Script"/>
       </w:pPr>
       <w:r>
-        <w:t xml:space="preserve">The research I read shaped how I designed this study.</w:t>
-      </w:r>
-    </w:p>
-    <w:p>
-      <w:pPr>
-        <w:pStyle w:val="Script"/>
-      </w:pPr>
-      <w:r>
-        <w:t xml:space="preserve">Johnson and colleagues found that developers stop using tools with noisy, unclear warnings. So I didn’t only count what each tool found. I also counted false alarms and scored the explanations.</w:t>
-      </w:r>
-    </w:p>
-    <w:p>
-      <w:pPr>
-        <w:pStyle w:val="Script"/>
-      </w:pPr>
-      <w:r>
-        <w:t xml:space="preserve">Rahman and colleagues listed common security mistakes in infrastructure code, such as open network rules and secrets written into the code. Several of my test cases are exactly these mistakes.</w:t>
-      </w:r>
-    </w:p>
-    <w:p>
-      <w:pPr>
-        <w:pStyle w:val="Script"/>
-      </w:pPr>
-      <w:r>
-        <w:t xml:space="preserve">Some tools, like the one by Li and colleagues, give the scanner’s results to the AI. Then you can’t tell what the AI found by itself. So I kept my AI reviewer separate.</w:t>
-      </w:r>
-    </w:p>
-    <w:p>
-      <w:pPr>
-        <w:pStyle w:val="Script"/>
-      </w:pPr>
-      <w:r>
-        <w:t xml:space="preserve">I added two more ideas once my early results showed they mattered. AI can answer the same question differently, so I ran every review three times. And AI fixes can be wrong, so I applied every fix and tested it again.</w:t>
-      </w:r>
-    </w:p>
-    <w:p>
-      <w:pPr>
-        <w:pStyle w:val="Script"/>
-      </w:pPr>
-      <w:r>
-        <w:t xml:space="preserve">The gap is simple: there are very few fair, direct comparisons of an AI reviewer with Terraform scanners.</w:t>
+        <w:t xml:space="preserve">The research I read shaped my design.</w:t>
+      </w:r>
+    </w:p>
+    <w:p>
+      <w:pPr>
+        <w:pStyle w:val="Script"/>
+      </w:pPr>
+      <w:r>
+        <w:t xml:space="preserve">Johnson and colleagues found that developers stop using tools that give too many unclear warnings. So I also counted false alarms, and I scored how clear the explanations were.</w:t>
+      </w:r>
+    </w:p>
+    <w:p>
+      <w:pPr>
+        <w:pStyle w:val="Script"/>
+      </w:pPr>
+      <w:r>
+        <w:t xml:space="preserve">Rahman and colleagues listed common security mistakes in this kind of code, like open network rules and passwords left in the code. Several of my tests use exactly these mistakes.</w:t>
+      </w:r>
+    </w:p>
+    <w:p>
+      <w:pPr>
+        <w:pStyle w:val="Script"/>
+      </w:pPr>
+      <w:r>
+        <w:t xml:space="preserve">Some tools, like the one by Li and colleagues, give the scanner’s results to the AI. Then you cannot tell what the AI found by itself. So I kept my AI separate from the scanners.</w:t>
+      </w:r>
+    </w:p>
+    <w:p>
+      <w:pPr>
+        <w:pStyle w:val="Script"/>
+      </w:pPr>
+      <w:r>
+        <w:t xml:space="preserve">Two more ideas came later, when my first results showed they mattered. AI can give different answers to the same question, so I ran every test three times. And AI fixes can be wrong, so I tried every fix and tested it again.</w:t>
+      </w:r>
+    </w:p>
+    <w:p>
+      <w:pPr>
+        <w:pStyle w:val="Script"/>
+      </w:pPr>
+      <w:r>
+        <w:t xml:space="preserve">The gap is simple: there are very few fair comparisons of an AI reviewer with these scanners.</w:t>
       </w:r>
     </w:p>
     <w:p>
@@ -1766,7 +1766,7 @@
         <w:rPr>
           <w:color w:val="5B6670"/>
         </w:rPr>
-        <w:t xml:space="preserve">   ·   about 1:10   ·   4:40 in total</w:t>
+        <w:t xml:space="preserve">   ·   about 1:20   ·   4:50 in total</w:t>
       </w:r>
     </w:p>
     <w:p>
@@ -1782,31 +1782,31 @@
         <w:pStyle w:val="Script"/>
       </w:pPr>
       <w:r>
-        <w:t xml:space="preserve">This is what I built. When a developer opens a pull request with Terraform code, GitHub Actions starts one job.</w:t>
-      </w:r>
-    </w:p>
-    <w:p>
-      <w:pPr>
-        <w:pStyle w:val="Script"/>
-      </w:pPr>
-      <w:r>
-        <w:t xml:space="preserve">First, it checks that the code is valid. It never deploys anything.</w:t>
-      </w:r>
-    </w:p>
-    <w:p>
-      <w:pPr>
-        <w:pStyle w:val="Script"/>
-      </w:pPr>
-      <w:r>
-        <w:t xml:space="preserve">Then three reviewers check the same code. Checkov and tfsec use fixed rules. My AI reviewer sends all the Terraform files, a short security policy and the README to Claude, and asks for a structured answer with at most three findings. Each tool posts its own comment on the pull request, and no tool sees another tool’s results.</w:t>
-      </w:r>
-    </w:p>
-    <w:p>
-      <w:pPr>
-        <w:pStyle w:val="Script"/>
-      </w:pPr>
-      <w:r>
-        <w:t xml:space="preserve">On the right are real results from pull request 71. In this test, SSH is open to the whole internet. Checkov passed seven checks and found nothing, so it missed the problem. tfsec flagged it as critical. The AI reviewer flagged it as high, and explained the risk and the fix.</w:t>
+        <w:t xml:space="preserve">This is the system I built, on GitHub.</w:t>
+      </w:r>
+    </w:p>
+    <w:p>
+      <w:pPr>
+        <w:pStyle w:val="Script"/>
+      </w:pPr>
+      <w:r>
+        <w:t xml:space="preserve">When a developer wants to change the code, they open a pull request, which is a request to add their change. This starts an automatic job. First, it checks that the code is valid. It never builds anything in the real cloud.</w:t>
+      </w:r>
+    </w:p>
+    <w:p>
+      <w:pPr>
+        <w:pStyle w:val="Script"/>
+      </w:pPr>
+      <w:r>
+        <w:t xml:space="preserve">Then three tools check the same code. Checkov and tfsec use fixed rules. My AI reviewer sends all the code, a short security policy and the project’s read-me file to Claude, the AI model, and asks for a clear answer with no more than three findings. Each tool posts its own comment, and no tool sees the others’ results.</w:t>
+      </w:r>
+    </w:p>
+    <w:p>
+      <w:pPr>
+        <w:pStyle w:val="Script"/>
+      </w:pPr>
+      <w:r>
+        <w:t xml:space="preserve">On the right are real results from one test. Here, SSH, which is remote login, is open to the whole internet. Checkov found nothing, so it missed the problem. tfsec marked it as critical. The AI marked it as high, and explained the risk and the fix.</w:t>
       </w:r>
     </w:p>
     <w:tbl>
@@ -1870,7 +1870,7 @@
         <w:pStyle w:val="Script"/>
       </w:pPr>
       <w:r>
-        <w:t xml:space="preserve">All the code and evidence are public on my GitHub.</w:t>
+        <w:t xml:space="preserve">All my code and evidence are public on GitHub.</w:t>
       </w:r>
     </w:p>
     <w:p>
@@ -1891,7 +1891,7 @@
         <w:rPr>
           <w:color w:val="5B6670"/>
         </w:rPr>
-        <w:t xml:space="preserve">   ·   about 1:25   ·   6:05 in total</w:t>
+        <w:t xml:space="preserve">   ·   about 1:15   ·   6:05 in total</w:t>
       </w:r>
     </w:p>
     <w:p>
@@ -1907,39 +1907,39 @@
         <w:pStyle w:val="Script"/>
       </w:pPr>
       <w:r>
-        <w:t xml:space="preserve">Here is how I tested it.</w:t>
-      </w:r>
-    </w:p>
-    <w:p>
-      <w:pPr>
-        <w:pStyle w:val="Script"/>
-      </w:pPr>
-      <w:r>
-        <w:t xml:space="preserve">I wrote fifteen Terraform test cases. For each one, I wrote down the correct answer before running any tool. I call this the ground truth. Twelve cases have a security problem. Three are safe, including a web server that is meant to be public. These check for false alarms.</w:t>
-      </w:r>
-    </w:p>
-    <w:p>
-      <w:pPr>
-        <w:pStyle w:val="Script"/>
-      </w:pPr>
-      <w:r>
-        <w:t xml:space="preserve">I opened each case as a pull request and ran it twice more. With one extra run after a failed one, that gave forty-six runs. I checked every result against the ground truth and scored the AI on six criteria I fixed in advance. Finally, I applied the AI’s own fixes and tested them again.</w:t>
-      </w:r>
-    </w:p>
-    <w:p>
-      <w:pPr>
-        <w:pStyle w:val="Script"/>
-      </w:pPr>
-      <w:r>
-        <w:t xml:space="preserve">One discovery changed the study. When I traced my early results back, I found the AI had been given the scanners’ findings, so those results were not independent. I fixed the workflow in pull request 69, ran every case with the AI working on its own, and checked all forty-six runs to prove it.</w:t>
-      </w:r>
-    </w:p>
-    <w:p>
-      <w:pPr>
-        <w:pStyle w:val="Script"/>
-      </w:pPr>
-      <w:r>
-        <w:t xml:space="preserve">Everything was synthetic: fake secrets, nothing deployed and no personal data.</w:t>
+        <w:t xml:space="preserve">This is how I tested it.</w:t>
+      </w:r>
+    </w:p>
+    <w:p>
+      <w:pPr>
+        <w:pStyle w:val="Script"/>
+      </w:pPr>
+      <w:r>
+        <w:t xml:space="preserve">I wrote fifteen small Terraform tests. For each one, I wrote down the correct answer before running any tool. Twelve tests have a security problem. Three are safe on purpose, to see if a tool raises false alarms.</w:t>
+      </w:r>
+    </w:p>
+    <w:p>
+      <w:pPr>
+        <w:pStyle w:val="Script"/>
+      </w:pPr>
+      <w:r>
+        <w:t xml:space="preserve">I ran each test three times. With one extra run after a failure, that made forty-six runs. I compared every result with the correct answer, and I scored the AI’s comments on six points that I fixed in advance. Then I tried the AI’s own fixes and tested them again.</w:t>
+      </w:r>
+    </w:p>
+    <w:p>
+      <w:pPr>
+        <w:pStyle w:val="Script"/>
+      </w:pPr>
+      <w:r>
+        <w:t xml:space="preserve">One discovery changed my study. I found that in my early runs, the AI had seen the scanners’ results, so it was not a fair test. I fixed the system, then ran every test with the AI working alone, and checked all forty-six runs to prove it.</w:t>
+      </w:r>
+    </w:p>
+    <w:p>
+      <w:pPr>
+        <w:pStyle w:val="Script"/>
+      </w:pPr>
+      <w:r>
+        <w:t xml:space="preserve">Everything was safe: fake passwords, nothing built in the real cloud, and no personal data.</w:t>
       </w:r>
     </w:p>
     <w:p>
@@ -1976,47 +1976,47 @@
         <w:pStyle w:val="Script"/>
       </w:pPr>
       <w:r>
-        <w:t xml:space="preserve">Now the results. My first question was about detection.</w:t>
-      </w:r>
-    </w:p>
-    <w:p>
-      <w:pPr>
-        <w:pStyle w:val="Script"/>
-      </w:pPr>
-      <w:r>
-        <w:t xml:space="preserve">Out of twelve cases with a problem, Checkov found five and tfsec found four. Together, they found eight. The AI reviewer found eleven, and part of a twelfth. In that case, it noticed the problem every time but showed it to the developer only once.</w:t>
-      </w:r>
-    </w:p>
-    <w:p>
-      <w:pPr>
-        <w:pStyle w:val="Script"/>
-      </w:pPr>
-      <w:r>
-        <w:t xml:space="preserve">Three things stand out. First, three problems were found only by the AI: two secrets written into the code, and a role with too much access, which it spotted by comparing it with a separate requirements file.</w:t>
-      </w:r>
-    </w:p>
-    <w:p>
-      <w:pPr>
-        <w:pStyle w:val="Script"/>
-      </w:pPr>
-      <w:r>
-        <w:t xml:space="preserve">Second, the scanners barely overlapped. Only one case was caught by both. And Checkov missed rules open to 0.0.0.0/0, but caught the same rule written as a star.</w:t>
-      </w:r>
-    </w:p>
-    <w:p>
-      <w:pPr>
-        <w:pStyle w:val="Script"/>
-      </w:pPr>
-      <w:r>
-        <w:t xml:space="preserve">Third, the AI made a different kind of mistake. Three of nine runs on safe cases raised a finding. Of the forty-five findings it posted, 82 per cent were correct, or 89 per cent if three findings about weaknesses in my own test files count as valid.</w:t>
-      </w:r>
-    </w:p>
-    <w:p>
-      <w:pPr>
-        <w:pStyle w:val="Script"/>
-      </w:pPr>
-      <w:r>
-        <w:t xml:space="preserve">These numbers describe my fifteen cases only, not the real world.</w:t>
+        <w:t xml:space="preserve">Now the results. My first question was: how accurate is the AI?</w:t>
+      </w:r>
+    </w:p>
+    <w:p>
+      <w:pPr>
+        <w:pStyle w:val="Script"/>
+      </w:pPr>
+      <w:r>
+        <w:t xml:space="preserve">There were twelve tests with a problem. Checkov found five, and tfsec found four. Together, the scanners found eight. The AI found eleven, and half-found one more: it saw that problem every time, but showed it to the developer only once.</w:t>
+      </w:r>
+    </w:p>
+    <w:p>
+      <w:pPr>
+        <w:pStyle w:val="Script"/>
+      </w:pPr>
+      <w:r>
+        <w:t xml:space="preserve">Three things stand out. First, the AI found three problems that both scanners missed: two secrets left in the code, and a role with too much power. It spotted that role by comparing it with a separate file of requirements.</w:t>
+      </w:r>
+    </w:p>
+    <w:p>
+      <w:pPr>
+        <w:pStyle w:val="Script"/>
+      </w:pPr>
+      <w:r>
+        <w:t xml:space="preserve">Second, the scanners hardly overlapped. Only one test was caught by both. And Checkov missed open internet access written as 0.0.0.0/0, but caught the same rule written as a star.</w:t>
+      </w:r>
+    </w:p>
+    <w:p>
+      <w:pPr>
+        <w:pStyle w:val="Script"/>
+      </w:pPr>
+      <w:r>
+        <w:t xml:space="preserve">Third, the AI made a different kind of mistake. On the safe tests, three runs out of nine raised a problem. And of the forty-five problems it posted, 82 out of 100 were correct, or 89 if three findings about weaknesses in my own tests count as fair.</w:t>
+      </w:r>
+    </w:p>
+    <w:p>
+      <w:pPr>
+        <w:pStyle w:val="Script"/>
+      </w:pPr>
+      <w:r>
+        <w:t xml:space="preserve">These numbers are only for my fifteen tests.</w:t>
       </w:r>
     </w:p>
     <w:p>
@@ -2037,7 +2037,7 @@
         <w:rPr>
           <w:color w:val="5B6670"/>
         </w:rPr>
-        <w:t xml:space="preserve">   ·   about 1:30   ·   9:00 in total</w:t>
+        <w:t xml:space="preserve">   ·   about 1:40   ·   9:10 in total</w:t>
       </w:r>
     </w:p>
     <w:p>
@@ -2053,39 +2053,47 @@
         <w:pStyle w:val="Script"/>
       </w:pPr>
       <w:r>
-        <w:t xml:space="preserve">My second question was about the quality of the AI’s fixes. I didn’t just read them. I applied them.</w:t>
-      </w:r>
-    </w:p>
-    <w:p>
-      <w:pPr>
-        <w:pStyle w:val="Script"/>
-      </w:pPr>
-      <w:r>
-        <w:t xml:space="preserve">All twelve fixes solved the problem and passed Terraform’s checks. For eight of them, a scanner also confirmed the fix. When the AI reviewed its own fixes, nine of the twelve no longer raised the problem.</w:t>
-      </w:r>
-    </w:p>
-    <w:p>
-      <w:pPr>
-        <w:pStyle w:val="Script"/>
-      </w:pPr>
-      <w:r>
-        <w:t xml:space="preserve">But one piece of advice was simply wrong. The AI said a role definition needs tags. When I applied that, Terraform failed with the error you can see here.</w:t>
-      </w:r>
-    </w:p>
-    <w:p>
-      <w:pPr>
-        <w:pStyle w:val="Script"/>
-      </w:pPr>
-      <w:r>
-        <w:t xml:space="preserve">My third question was about the likely effect on developers’ understanding. I judged this from the feedback itself. The chart shows the average scores out of two. The AI explained what was wrong, why it mattered and how to fix it, in plain language. The scanners only gave a rule ID and one short line. So the likely effect is positive.</w:t>
-      </w:r>
-    </w:p>
-    <w:p>
-      <w:pPr>
-        <w:pStyle w:val="Script"/>
-      </w:pPr>
-      <w:r>
-        <w:t xml:space="preserve">The lowest score was for the accuracy of explanations. Sometimes the AI stated something false with confidence, and a developer could learn it as fact. These scores come from one scoring pass with AI help, and no second rater.</w:t>
+        <w:t xml:space="preserve">My second question was: how good are the AI’s fixes? I did not just read them. I tried them.</w:t>
+      </w:r>
+    </w:p>
+    <w:p>
+      <w:pPr>
+        <w:pStyle w:val="Script"/>
+      </w:pPr>
+      <w:r>
+        <w:t xml:space="preserve">All twelve fixes solved the problem and passed Terraform’s checks. For eight, a scanner also agreed the problem was gone. And when the AI checked its own fixed code, it no longer saw the problem in nine of the twelve.</w:t>
+      </w:r>
+    </w:p>
+    <w:p>
+      <w:pPr>
+        <w:pStyle w:val="Script"/>
+      </w:pPr>
+      <w:r>
+        <w:t xml:space="preserve">But one piece of advice was wrong. The AI said a certain role needs tags, which are labels. When I followed that advice, Terraform gave the error you can see here, and the code broke.</w:t>
+      </w:r>
+    </w:p>
+    <w:p>
+      <w:pPr>
+        <w:pStyle w:val="Script"/>
+      </w:pPr>
+      <w:r>
+        <w:t xml:space="preserve">My third question was: will the AI’s comments help developers understand the problem? To answer it, I looked closely at every AI comment and scored it. The chart shows the average scores, out of two.</w:t>
+      </w:r>
+    </w:p>
+    <w:p>
+      <w:pPr>
+        <w:pStyle w:val="Script"/>
+      </w:pPr>
+      <w:r>
+        <w:t xml:space="preserve">The AI explained what was wrong, why it was dangerous and how to fix it, in plain English, about the exact code. The scanners gave only a rule number and one short line. So the AI’s comments are likely to help developers learn.</w:t>
+      </w:r>
+    </w:p>
+    <w:p>
+      <w:pPr>
+        <w:pStyle w:val="Script"/>
+      </w:pPr>
+      <w:r>
+        <w:t xml:space="preserve">But there is a risk. The lowest score was for explanation accuracy. Sometimes the AI said something false while sounding sure, and a developer could learn the wrong thing. I scored the comments once, with AI help.</w:t>
       </w:r>
     </w:p>
     <w:p>
@@ -2106,7 +2114,7 @@
         <w:rPr>
           <w:color w:val="5B6670"/>
         </w:rPr>
-        <w:t xml:space="preserve">   ·   about 1:30   ·   10:30 in total</w:t>
+        <w:t xml:space="preserve">   ·   about 1:35   ·   10:45 in total</w:t>
       </w:r>
     </w:p>
     <w:p>
@@ -2122,39 +2130,39 @@
         <w:pStyle w:val="Script"/>
       </w:pPr>
       <w:r>
-        <w:t xml:space="preserve">My fourth question was about practical challenges, and this was my most surprising finding.</w:t>
-      </w:r>
-    </w:p>
-    <w:p>
-      <w:pPr>
-        <w:pStyle w:val="Script"/>
-      </w:pPr>
-      <w:r>
-        <w:t xml:space="preserve">On the left is the same fix, reviewed twice. The only difference is a comment in the code.</w:t>
-      </w:r>
-    </w:p>
-    <w:p>
-      <w:pPr>
-        <w:pStyle w:val="Script"/>
-      </w:pPr>
-      <w:r>
-        <w:t xml:space="preserve">In version A, an old comment still said “Deliberately unrestricted SSH access”. The AI gave its own fix a high-severity finding and quoted that comment. In version B, I only corrected the comment, and the AI approved the change with just a low note. Another test case behaved the same way.</w:t>
-      </w:r>
-    </w:p>
-    <w:p>
-      <w:pPr>
-        <w:pStyle w:val="Script"/>
-      </w:pPr>
-      <w:r>
-        <w:t xml:space="preserve">So text in the code can change the AI’s verdict, even when the code is the same. This is a form of what Greshake and colleagues call indirect prompt injection. In a real team, anyone who can write a comment could influence the AI.</w:t>
-      </w:r>
-    </w:p>
-    <w:p>
-      <w:pPr>
-        <w:pStyle w:val="Script"/>
-      </w:pPr>
-      <w:r>
-        <w:t xml:space="preserve">I found three more challenges. The same input gave different answers: one case was classified three different ways in four runs. Some real findings were hidden from the developer, and pull requests that only delete files skipped the AI completely. Time was not a problem: the AI took about thirty seconds, and feedback arrived in under two minutes.</w:t>
+        <w:t xml:space="preserve">My fourth question was about problems in real use, and this was my most surprising finding.</w:t>
+      </w:r>
+    </w:p>
+    <w:p>
+      <w:pPr>
+        <w:pStyle w:val="Script"/>
+      </w:pPr>
+      <w:r>
+        <w:t xml:space="preserve">On the left is the same fix, checked twice. The only difference is one comment. A comment is just a note for people. It does not change what the code does.</w:t>
+      </w:r>
+    </w:p>
+    <w:p>
+      <w:pPr>
+        <w:pStyle w:val="Script"/>
+      </w:pPr>
+      <w:r>
+        <w:t xml:space="preserve">In version A, an old comment said “Deliberately unrestricted SSH access”. The AI gave its own fix a high-risk warning, and it quoted that comment. In version B, I only changed the comment, and the AI approved the fix with just a small note. Another test showed the same thing.</w:t>
+      </w:r>
+    </w:p>
+    <w:p>
+      <w:pPr>
+        <w:pStyle w:val="Script"/>
+      </w:pPr>
+      <w:r>
+        <w:t xml:space="preserve">So one comment can change the AI’s decision, even when the code is the same. Greshake and colleagues call this indirect prompt injection, where text that the AI reads changes what it does. In a real team, anyone who can write a comment could influence it.</w:t>
+      </w:r>
+    </w:p>
+    <w:p>
+      <w:pPr>
+        <w:pStyle w:val="Script"/>
+      </w:pPr>
+      <w:r>
+        <w:t xml:space="preserve">I found three more problems. The AI gave different answers to the same test. Some real problems were hidden from the developer. And changes that only deleted files were not checked by the AI at all. The good news is that it was fast: feedback came in under two minutes.</w:t>
       </w:r>
     </w:p>
     <w:p>
@@ -2175,7 +2183,7 @@
         <w:rPr>
           <w:color w:val="5B6670"/>
         </w:rPr>
-        <w:t xml:space="preserve">   ·   about 1:20   ·   11:50 in total</w:t>
+        <w:t xml:space="preserve">   ·   about 1:20   ·   12:05 in total</w:t>
       </w:r>
     </w:p>
     <w:p>
@@ -2191,39 +2199,39 @@
         <w:pStyle w:val="Script"/>
       </w:pPr>
       <w:r>
-        <w:t xml:space="preserve">So, how far can we trust these results?</w:t>
-      </w:r>
-    </w:p>
-    <w:p>
-      <w:pPr>
-        <w:pStyle w:val="Script"/>
-      </w:pPr>
-      <w:r>
-        <w:t xml:space="preserve">Some findings are strong. Scanners only cover what their rules describe. The two scanners complemented each other. The AI found problems that need context, and its mistakes were less predictable.</w:t>
-      </w:r>
-    </w:p>
-    <w:p>
-      <w:pPr>
-        <w:pStyle w:val="Script"/>
-      </w:pPr>
-      <w:r>
-        <w:t xml:space="preserve">But there are real limits. I used fifteen test cases that I built myself, one cloud, one AI model and one prompt. I also chose some cases where scanner rules were weak, which makes the AI look better. As Ding and colleagues warn, test sets like this can flatter AI. Comments in my test files may have given the AI hints. And the scoring was done once, without a second person.</w:t>
-      </w:r>
-    </w:p>
-    <w:p>
-      <w:pPr>
-        <w:pStyle w:val="Script"/>
-      </w:pPr>
-      <w:r>
-        <w:t xml:space="preserve">My biggest lesson came from my own mistake. Results I first thought were independent were not. Fixing that cost time, but it saved the study. Now I only trust a result when I can link it to a run, a commit and the raw output.</w:t>
-      </w:r>
-    </w:p>
-    <w:p>
-      <w:pPr>
-        <w:pStyle w:val="Script"/>
-      </w:pPr>
-      <w:r>
-        <w:t xml:space="preserve">Overall, all four objectives were met, within the limits of this sample.</w:t>
+        <w:t xml:space="preserve">So, how much can we trust these results?</w:t>
+      </w:r>
+    </w:p>
+    <w:p>
+      <w:pPr>
+        <w:pStyle w:val="Script"/>
+      </w:pPr>
+      <w:r>
+        <w:t xml:space="preserve">Some findings are strong. Scanners only find what is on their list. The two scanners helped each other. The AI found problems that need the wider picture, but its mistakes were harder to predict.</w:t>
+      </w:r>
+    </w:p>
+    <w:p>
+      <w:pPr>
+        <w:pStyle w:val="Script"/>
+      </w:pPr>
+      <w:r>
+        <w:t xml:space="preserve">There are real limits too. I used only fifteen tests that I wrote myself, with one cloud and one AI model. I chose some tests where scanners were weak, which makes the AI look better. Ding and colleagues warn that test sets like this can flatter AI. Comments in my tests may have given the AI hints. And I scored the results only once.</w:t>
+      </w:r>
+    </w:p>
+    <w:p>
+      <w:pPr>
+        <w:pStyle w:val="Script"/>
+      </w:pPr>
+      <w:r>
+        <w:t xml:space="preserve">My biggest lesson came from my own mistake. Results I thought were fair were not. Fixing that took time, but it saved the study. Now I only trust a result when I can trace it back to the exact run and its raw output.</w:t>
+      </w:r>
+    </w:p>
+    <w:p>
+      <w:pPr>
+        <w:pStyle w:val="Script"/>
+      </w:pPr>
+      <w:r>
+        <w:t xml:space="preserve">Overall, I met all four objectives, within the limits of this small test set.</w:t>
       </w:r>
     </w:p>
     <w:p>
@@ -2244,7 +2252,7 @@
         <w:rPr>
           <w:color w:val="5B6670"/>
         </w:rPr>
-        <w:t xml:space="preserve">   ·   about 1:10   ·   13:00 in total</w:t>
+        <w:t xml:space="preserve">   ·   about 1:10   ·   13:15 in total</w:t>
       </w:r>
     </w:p>
     <w:p>
@@ -2260,31 +2268,31 @@
         <w:pStyle w:val="Script"/>
       </w:pPr>
       <w:r>
-        <w:t xml:space="preserve">So, can AI improve the security review of infrastructure code? On these fifteen cases, my answer is a qualified yes. The AI found everything the scanners found, plus three problems they missed. But its mistakes were less predictable. So it should support the scanners, not replace them, and it should not decide which changes get merged.</w:t>
-      </w:r>
-    </w:p>
-    <w:p>
-      <w:pPr>
-        <w:pStyle w:val="Script"/>
-      </w:pPr>
-      <w:r>
-        <w:t xml:space="preserve">My recommendations are on the left: let the scanners enforce and the AI advise, use more than one scanner, treat comments as untrusted, show uncertain findings, test every AI fix automatically, and review changes that only delete files.</w:t>
-      </w:r>
-    </w:p>
-    <w:p>
-      <w:pPr>
-        <w:pStyle w:val="Script"/>
-      </w:pPr>
-      <w:r>
-        <w:t xml:space="preserve">For future work, I would test real-world Terraform changes, run many more reviews across different AI models, study comment manipulation on purpose, and test the feedback with real developers.</w:t>
-      </w:r>
-    </w:p>
-    <w:p>
-      <w:pPr>
-        <w:pStyle w:val="Script"/>
-      </w:pPr>
-      <w:r>
-        <w:t xml:space="preserve">The references are on this slide, and the code and evidence are on GitHub. Thank you for listening.</w:t>
+        <w:t xml:space="preserve">So, can AI help to check cloud code for security problems? On my fifteen tests, the answer is yes, but with conditions. The AI found everything the scanners found, plus three problems they missed. But its mistakes were harder to predict. So it should work next to the scanners, not replace them, and it should not decide on its own which changes are accepted.</w:t>
+      </w:r>
+    </w:p>
+    <w:p>
+      <w:pPr>
+        <w:pStyle w:val="Script"/>
+      </w:pPr>
+      <w:r>
+        <w:t xml:space="preserve">My advice is on the left: let the scanners enforce the rules and the AI give advice, use more than one scanner, treat code comments as untrusted, show the AI’s unsure findings, test every AI fix automatically, and check changes that only delete files.</w:t>
+      </w:r>
+    </w:p>
+    <w:p>
+      <w:pPr>
+        <w:pStyle w:val="Script"/>
+      </w:pPr>
+      <w:r>
+        <w:t xml:space="preserve">Next, I would test real-world code, use more AI models, study comment tricks on purpose, and test the comments with real developers.</w:t>
+      </w:r>
+    </w:p>
+    <w:p>
+      <w:pPr>
+        <w:pStyle w:val="Script"/>
+      </w:pPr>
+      <w:r>
+        <w:t xml:space="preserve">The references are on this slide, and my code is on GitHub. Thank you for listening.</w:t>
       </w:r>
     </w:p>
     <w:p>

</xml_diff>

<commit_message>
Presentation: redesigned slides (fewer words, more visuals) and script v4 to match
Slides 2-10 rebuilt with build_deck_v2.js: icon steps, detection grid (S6),
comment comparison and score chart (S7), verdict pills (S8), evidence-chain
lesson (S9) and roles diagram (S10). Quotes re-checked against PR #71, #85,
#86 and #98; numbers re-checked against the dissertation v4.

Co-Authored-By: Claude Opus 5.5 <noreply@anthropic.com>
Claude-Session: https://claude.ai/code/session_019GGG1f33Kz2g4dpPAJoY44
</commit_message>
<xml_diff>
--- a/evidence/prom06/presentation/PROM06_Speaker_Script.docx
+++ b/evidence/prom06/presentation/PROM06_Speaker_Script.docx
@@ -70,7 +70,7 @@
         <w:spacing w:after="80"/>
       </w:pPr>
       <w:r>
-        <w:t xml:space="preserve">It is about 1,650 words and takes about 13 minutes at a steady pace (125 words a minute). The brief allows 10 to 15 minutes.</w:t>
+        <w:t xml:space="preserve">It is about 1,700 words and takes about 14 minutes at a steady pace (125 words a minute). The brief allows 10 to 15 minutes.</w:t>
       </w:r>
     </w:p>
     <w:p>
@@ -847,7 +847,7 @@
                 <w:sz w:val="21"/>
                 <w:szCs w:val="21"/>
               </w:rPr>
-              <w:t xml:space="preserve">How I tested it: fixed ground truth, repeated runs</w:t>
+              <w:t xml:space="preserve">How I tested it: fixed answers, three runs each</w:t>
             </w:r>
           </w:p>
         </w:tc>
@@ -975,7 +975,7 @@
                 <w:sz w:val="21"/>
                 <w:szCs w:val="21"/>
               </w:rPr>
-              <w:t xml:space="preserve">RQ1: the AI detected more than both scanners</w:t>
+              <w:t xml:space="preserve">RQ1: the AI found more than the scanners combined</w:t>
             </w:r>
           </w:p>
         </w:tc>
@@ -1007,7 +1007,7 @@
                 <w:sz w:val="21"/>
                 <w:szCs w:val="21"/>
               </w:rPr>
-              <w:t xml:space="preserve">1:25</w:t>
+              <w:t xml:space="preserve">1:35</w:t>
             </w:r>
           </w:p>
         </w:tc>
@@ -1039,7 +1039,7 @@
                 <w:sz w:val="21"/>
                 <w:szCs w:val="21"/>
               </w:rPr>
-              <w:t xml:space="preserve">7:30</w:t>
+              <w:t xml:space="preserve">7:40</w:t>
             </w:r>
           </w:p>
         </w:tc>
@@ -1165,7 +1165,7 @@
                 <w:sz w:val="21"/>
                 <w:szCs w:val="21"/>
               </w:rPr>
-              <w:t xml:space="preserve">9:10</w:t>
+              <w:t xml:space="preserve">9:20</w:t>
             </w:r>
           </w:p>
         </w:tc>
@@ -1295,7 +1295,7 @@
                 <w:sz w:val="21"/>
                 <w:szCs w:val="21"/>
               </w:rPr>
-              <w:t xml:space="preserve">10:45</w:t>
+              <w:t xml:space="preserve">10:55</w:t>
             </w:r>
           </w:p>
         </w:tc>
@@ -1390,7 +1390,7 @@
                 <w:sz w:val="21"/>
                 <w:szCs w:val="21"/>
               </w:rPr>
-              <w:t xml:space="preserve">1:20</w:t>
+              <w:t xml:space="preserve">1:30</w:t>
             </w:r>
           </w:p>
         </w:tc>
@@ -1421,7 +1421,7 @@
                 <w:sz w:val="21"/>
                 <w:szCs w:val="21"/>
               </w:rPr>
-              <w:t xml:space="preserve">12:05</w:t>
+              <w:t xml:space="preserve">12:25</w:t>
             </w:r>
           </w:p>
         </w:tc>
@@ -1519,7 +1519,7 @@
                 <w:sz w:val="21"/>
                 <w:szCs w:val="21"/>
               </w:rPr>
-              <w:t xml:space="preserve">1:10</w:t>
+              <w:t xml:space="preserve">1:15</w:t>
             </w:r>
           </w:p>
         </w:tc>
@@ -1551,7 +1551,7 @@
                 <w:sz w:val="21"/>
                 <w:szCs w:val="21"/>
               </w:rPr>
-              <w:t xml:space="preserve">13:15</w:t>
+              <w:t xml:space="preserve">13:40</w:t>
             </w:r>
           </w:p>
         </w:tc>
@@ -1668,7 +1668,7 @@
         <w:pStyle w:val="Script"/>
       </w:pPr>
       <w:r>
-        <w:t xml:space="preserve">So my aim was to find out how well an AI reviewer works, compared with these scanners. I asked four questions. How accurate is it? How good are its fixes? Will its comments help developers understand? And what problems come up in real use? My objectives were to read the research, build the system, test it fairly, and find its strengths and limits.</w:t>
+        <w:t xml:space="preserve">So my aim was to find out how well an AI reviewer works, compared with these scanners. I asked four questions. Does it find the problems? Do its fixes work? Do its comments help developers understand? And what goes wrong in real use? My objectives were to review the research, build the system, compare it with the scanners, and find its benefits and limits.</w:t>
       </w:r>
     </w:p>
     <w:p>
@@ -1798,7 +1798,7 @@
         <w:pStyle w:val="Script"/>
       </w:pPr>
       <w:r>
-        <w:t xml:space="preserve">Then three tools check the same code. Checkov and tfsec use fixed rules. My AI reviewer sends all the code, a short security policy and the project’s read-me file to Claude, the AI model, and asks for a clear answer with no more than three findings. Each tool posts its own comment, and no tool sees the others’ results.</w:t>
+        <w:t xml:space="preserve">Then three tools check the same code. Checkov and tfsec use fixed rules. My AI reviewer sends all the code, a short security policy and the project’s read-me file to Claude, the AI model, and asks for a clear answer with no more than three findings. Each tool posts its own comment, and no tool sees the others’ results. Then I compare each comment with the correct answer.</w:t>
       </w:r>
     </w:p>
     <w:p>
@@ -1867,14 +1867,6 @@
     </w:p>
     <w:p>
       <w:pPr>
-        <w:pStyle w:val="Script"/>
-      </w:pPr>
-      <w:r>
-        <w:t xml:space="preserve">All my code and evidence are public on GitHub.</w:t>
-      </w:r>
-    </w:p>
-    <w:p>
-      <w:pPr>
         <w:pageBreakBefore/>
         <w:spacing w:after="60"/>
       </w:pPr>
@@ -1899,7 +1891,7 @@
         <w:pStyle w:val="Heading1"/>
       </w:pPr>
       <w:r>
-        <w:t xml:space="preserve">How I tested it: fixed ground truth, repeated runs</w:t>
+        <w:t xml:space="preserve">How I tested it: fixed answers, three runs each</w:t>
       </w:r>
     </w:p>
     <w:p>
@@ -1915,15 +1907,15 @@
         <w:pStyle w:val="Script"/>
       </w:pPr>
       <w:r>
-        <w:t xml:space="preserve">I wrote fifteen small Terraform tests. For each one, I wrote down the correct answer before running any tool. Twelve tests have a security problem. Three are safe on purpose, to see if a tool raises false alarms.</w:t>
-      </w:r>
-    </w:p>
-    <w:p>
-      <w:pPr>
-        <w:pStyle w:val="Script"/>
-      </w:pPr>
-      <w:r>
-        <w:t xml:space="preserve">I ran each test three times. With one extra run after a failure, that made forty-six runs. I compared every result with the correct answer, and I scored the AI’s comments on six points that I fixed in advance. Then I tried the AI’s own fixes and tested them again.</w:t>
+        <w:t xml:space="preserve">I wrote fifteen small Terraform tests. For each one, I wrote down the correct answer before running any tool. Twelve tests have a security problem, in network rules, encryption, logging, secrets or identity. Three are safe on purpose, to see if a tool raises false alarms.</w:t>
+      </w:r>
+    </w:p>
+    <w:p>
+      <w:pPr>
+        <w:pStyle w:val="Script"/>
+      </w:pPr>
+      <w:r>
+        <w:t xml:space="preserve">I ran each test three times. With one extra run after a failure, that made forty-six runs. I compared every result with the correct answer, and I scored each AI review on six quality points. Then I tried the AI’s own fixes and checked them.</w:t>
       </w:r>
     </w:p>
     <w:p>
@@ -1960,7 +1952,7 @@
         <w:rPr>
           <w:color w:val="5B6670"/>
         </w:rPr>
-        <w:t xml:space="preserve">   ·   about 1:25   ·   7:30 in total</w:t>
+        <w:t xml:space="preserve">   ·   about 1:35   ·   7:40 in total</w:t>
       </w:r>
     </w:p>
     <w:p>
@@ -1968,23 +1960,23 @@
         <w:pStyle w:val="Heading1"/>
       </w:pPr>
       <w:r>
-        <w:t xml:space="preserve">RQ1: the AI detected more than both scanners</w:t>
-      </w:r>
-    </w:p>
-    <w:p>
-      <w:pPr>
-        <w:pStyle w:val="Script"/>
-      </w:pPr>
-      <w:r>
-        <w:t xml:space="preserve">Now the results. My first question was: how accurate is the AI?</w:t>
-      </w:r>
-    </w:p>
-    <w:p>
-      <w:pPr>
-        <w:pStyle w:val="Script"/>
-      </w:pPr>
-      <w:r>
-        <w:t xml:space="preserve">There were twelve tests with a problem. Checkov found five, and tfsec found four. Together, the scanners found eight. The AI found eleven, and half-found one more: it saw that problem every time, but showed it to the developer only once.</w:t>
+        <w:t xml:space="preserve">RQ1: the AI found more than the scanners combined</w:t>
+      </w:r>
+    </w:p>
+    <w:p>
+      <w:pPr>
+        <w:pStyle w:val="Script"/>
+      </w:pPr>
+      <w:r>
+        <w:t xml:space="preserve">Now the results. My first question was: does the AI find the problems?</w:t>
+      </w:r>
+    </w:p>
+    <w:p>
+      <w:pPr>
+        <w:pStyle w:val="Script"/>
+      </w:pPr>
+      <w:r>
+        <w:t xml:space="preserve">In this grid, each square is one test with a problem. A filled square means found. Checkov found five, and tfsec found four. Together, the scanners found eight. The AI found eleven, and partly found one more: it saw that problem every time, but showed it to the developer only once.</w:t>
       </w:r>
     </w:p>
     <w:p>
@@ -2008,7 +2000,7 @@
         <w:pStyle w:val="Script"/>
       </w:pPr>
       <w:r>
-        <w:t xml:space="preserve">Third, the AI made a different kind of mistake. On the safe tests, three runs out of nine raised a problem. And of the forty-five problems it posted, 82 out of 100 were correct, or 89 if three findings about weaknesses in my own tests count as fair.</w:t>
+        <w:t xml:space="preserve">Third, the AI made a different kind of mistake. On the safe tests, three runs out of nine got a wrong warning, and one even said do not merge. Of the forty-five problems it posted, 82 out of 100 were correct, or 89 if three findings about weaknesses in my own tests count as fair.</w:t>
       </w:r>
     </w:p>
     <w:p>
@@ -2037,7 +2029,7 @@
         <w:rPr>
           <w:color w:val="5B6670"/>
         </w:rPr>
-        <w:t xml:space="preserve">   ·   about 1:40   ·   9:10 in total</w:t>
+        <w:t xml:space="preserve">   ·   about 1:40   ·   9:20 in total</w:t>
       </w:r>
     </w:p>
     <w:p>
@@ -2053,15 +2045,15 @@
         <w:pStyle w:val="Script"/>
       </w:pPr>
       <w:r>
-        <w:t xml:space="preserve">My second question was: how good are the AI’s fixes? I did not just read them. I tried them.</w:t>
-      </w:r>
-    </w:p>
-    <w:p>
-      <w:pPr>
-        <w:pStyle w:val="Script"/>
-      </w:pPr>
-      <w:r>
-        <w:t xml:space="preserve">All twelve fixes solved the problem and passed Terraform’s checks. For eight, a scanner also agreed the problem was gone. And when the AI checked its own fixed code, it no longer saw the problem in nine of the twelve.</w:t>
+        <w:t xml:space="preserve">My second question was: do the AI’s fixes work? I did not just read them. I tried them.</w:t>
+      </w:r>
+    </w:p>
+    <w:p>
+      <w:pPr>
+        <w:pStyle w:val="Script"/>
+      </w:pPr>
+      <w:r>
+        <w:t xml:space="preserve">All twelve fixes solved the problem and passed Terraform’s checks. For eight, a scanner also agreed the problem was gone. And when the AI checked its own fixed code, it no longer saw the problem in nine of the twelve. An old comment got in the way of two others.</w:t>
       </w:r>
     </w:p>
     <w:p>
@@ -2077,23 +2069,15 @@
         <w:pStyle w:val="Script"/>
       </w:pPr>
       <w:r>
-        <w:t xml:space="preserve">My third question was: will the AI’s comments help developers understand the problem? To answer it, I looked closely at every AI comment and scored it. The chart shows the average scores, out of two.</w:t>
-      </w:r>
-    </w:p>
-    <w:p>
-      <w:pPr>
-        <w:pStyle w:val="Script"/>
-      </w:pPr>
-      <w:r>
-        <w:t xml:space="preserve">The AI explained what was wrong, why it was dangerous and how to fix it, in plain English, about the exact code. The scanners gave only a rule number and one short line. So the AI’s comments are likely to help developers learn.</w:t>
-      </w:r>
-    </w:p>
-    <w:p>
-      <w:pPr>
-        <w:pStyle w:val="Script"/>
-      </w:pPr>
-      <w:r>
-        <w:t xml:space="preserve">But there is a risk. The lowest score was for explanation accuracy. Sometimes the AI said something false while sounding sure, and a developer could learn the wrong thing. I scored the comments once, with AI help.</w:t>
+        <w:t xml:space="preserve">My third question was: do the AI’s comments help developers understand? At the top, you can see the difference. The scanner gives a rule number and one short line. The AI explains what is wrong, why it matters and how to fix it, in plain English, about the exact code. So its comments are likely to help developers learn.</w:t>
+      </w:r>
+    </w:p>
+    <w:p>
+      <w:pPr>
+        <w:pStyle w:val="Script"/>
+      </w:pPr>
+      <w:r>
+        <w:t xml:space="preserve">I scored every AI comment, and the bars show three of the scores, out of two. The lowest was explanation accuracy. Sometimes the AI said something false while sounding sure, and a developer could learn the wrong thing. I scored the comments once, with AI help.</w:t>
       </w:r>
     </w:p>
     <w:p>
@@ -2114,7 +2098,7 @@
         <w:rPr>
           <w:color w:val="5B6670"/>
         </w:rPr>
-        <w:t xml:space="preserve">   ·   about 1:35   ·   10:45 in total</w:t>
+        <w:t xml:space="preserve">   ·   about 1:35   ·   10:55 in total</w:t>
       </w:r>
     </w:p>
     <w:p>
@@ -2162,7 +2146,7 @@
         <w:pStyle w:val="Script"/>
       </w:pPr>
       <w:r>
-        <w:t xml:space="preserve">I found three more problems. The AI gave different answers to the same test. Some real problems were hidden from the developer. And changes that only deleted files were not checked by the AI at all. The good news is that it was fast: feedback came in under two minutes.</w:t>
+        <w:t xml:space="preserve">On the right are three more findings. The AI gave different answers to the same test: high, high, then medium. Some real problems were hidden from the developer, and changes that only deleted files were not checked by the AI at all. The good news is that it was fast: feedback came in under two minutes.</w:t>
       </w:r>
     </w:p>
     <w:p>
@@ -2183,7 +2167,7 @@
         <w:rPr>
           <w:color w:val="5B6670"/>
         </w:rPr>
-        <w:t xml:space="preserve">   ·   about 1:20   ·   12:05 in total</w:t>
+        <w:t xml:space="preserve">   ·   about 1:30   ·   12:25 in total</w:t>
       </w:r>
     </w:p>
     <w:p>
@@ -2207,23 +2191,23 @@
         <w:pStyle w:val="Script"/>
       </w:pPr>
       <w:r>
-        <w:t xml:space="preserve">Some findings are strong. Scanners only find what is on their list. The two scanners helped each other. The AI found problems that need the wider picture, but its mistakes were harder to predict.</w:t>
-      </w:r>
-    </w:p>
-    <w:p>
-      <w:pPr>
-        <w:pStyle w:val="Script"/>
-      </w:pPr>
-      <w:r>
-        <w:t xml:space="preserve">There are real limits too. I used only fifteen tests that I wrote myself, with one cloud and one AI model. I chose some tests where scanners were weak, which makes the AI look better. Ding and colleagues warn that test sets like this can flatter AI. Comments in my tests may have given the AI hints. And I scored the results only once.</w:t>
-      </w:r>
-    </w:p>
-    <w:p>
-      <w:pPr>
-        <w:pStyle w:val="Script"/>
-      </w:pPr>
-      <w:r>
-        <w:t xml:space="preserve">My biggest lesson came from my own mistake. Results I thought were fair were not. Fixing that took time, but it saved the study. Now I only trust a result when I can trace it back to the exact run and its raw output.</w:t>
+        <w:t xml:space="preserve">Some findings are strong. Scanners only find what is on their list. The two scanners helped each other. The AI found problems that need the wider picture. And its answers changed from run to run.</w:t>
+      </w:r>
+    </w:p>
+    <w:p>
+      <w:pPr>
+        <w:pStyle w:val="Script"/>
+      </w:pPr>
+      <w:r>
+        <w:t xml:space="preserve">There are real limits too. I used only fifteen tests that I wrote myself, with one cloud and one AI model. I chose some tests where scanners were weak, which makes the AI look better. Ding and colleagues warn that test sets like this can flatter AI. Comments in my tests, and a policy file that only the AI could read, may have helped it. And I scored the results only once.</w:t>
+      </w:r>
+    </w:p>
+    <w:p>
+      <w:pPr>
+        <w:pStyle w:val="Script"/>
+      </w:pPr>
+      <w:r>
+        <w:t xml:space="preserve">My biggest lesson came from my own mistake. When I traced each result back to its run, I found that results I thought were fair were not. Fixing that took time, but it saved the study. Now I only trust a result when I can link it to its run, its commit and its raw output.</w:t>
       </w:r>
     </w:p>
     <w:p>
@@ -2252,7 +2236,7 @@
         <w:rPr>
           <w:color w:val="5B6670"/>
         </w:rPr>
-        <w:t xml:space="preserve">   ·   about 1:10   ·   13:15 in total</w:t>
+        <w:t xml:space="preserve">   ·   about 1:15   ·   13:40 in total</w:t>
       </w:r>
     </w:p>
     <w:p>
@@ -2276,7 +2260,7 @@
         <w:pStyle w:val="Script"/>
       </w:pPr>
       <w:r>
-        <w:t xml:space="preserve">My advice is on the left: let the scanners enforce the rules and the AI give advice, use more than one scanner, treat code comments as untrusted, show the AI’s unsure findings, test every AI fix automatically, and check changes that only delete files.</w:t>
+        <w:t xml:space="preserve">The diagram shows the roles: the scanners enforce the rules, the AI gives advice, and people decide. My advice is below it: use more than one scanner, treat code comments as untrusted, show the AI’s unsure findings, test every AI fix automatically, check changes that only delete files, and record which AI model was used.</w:t>
       </w:r>
     </w:p>
     <w:p>

</xml_diff>